<commit_message>
Paper: correct author names and affiliations
</commit_message>
<xml_diff>
--- a/docs/paper/gs-vision-BRM-tutorial.docx
+++ b/docs/paper/gs-vision-BRM-tutorial.docx
@@ -15,7 +15,7 @@
         <w:pStyle w:val="Author"/>
       </w:pPr>
       <w:r>
-        <w:t xml:space="preserve">Bruce Farnod</w:t>
+        <w:t xml:space="preserve">Amirreza Bagherzadeh</w:t>
       </w:r>
       <w:r>
         <w:rPr>
@@ -50,7 +50,7 @@
         <w:t xml:space="preserve"> </w:t>
       </w:r>
       <w:r>
-        <w:t xml:space="preserve">[Affiliation, department, institution, city, country]</w:t>
+        <w:t xml:space="preserve">Independent researcher</w:t>
       </w:r>
     </w:p>
     <w:p>

</xml_diff>